<commit_message>
site template: three professional designs, the free faces by name, headings in the template's full style
docx-template.py now writes Editorial (Caladea text under Libre Franklin
headings, teal and a red rule; the default), Technical (Carlito, navy band) or
Modern (Work Sans, Poppins, blue). A Writer document may name the free faces
Slides ships (Poppins, Work Sans, Libre Franklin, Archivo Black) and gets them on
every platform. A dressed import applies the template's entry for a heading,
quote or code paragraph in full, so the rule under a Heading 1 is drawn, not only
its face. The starter template is Editorial now; the gate follows.

Co-Authored-By: Claude Fable 5.1 <noreply@anthropic.com>
Claude-Session: https://claude.ai/code/session_01G9VUDSmWQCJDuxqUe1jG7b
</commit_message>
<xml_diff>
--- a/examples/site/template/starter.docx
+++ b/examples/site/template/starter.docx
@@ -79,16 +79,16 @@
   <w:docDefaults>
     <w:rPrDefault>
       <w:rPr>
-        <w:rFonts w:ascii="Arial" w:hAnsi="Arial" w:cs="Arial"/>
-        <w:sz w:val="22"/>
-        <w:szCs w:val="22"/>
-        <w:color w:val="1F2328"/>
+        <w:rFonts w:ascii="Caladea" w:hAnsi="Caladea" w:cs="Caladea"/>
+        <w:sz w:val="23"/>
+        <w:szCs w:val="23"/>
+        <w:color w:val="222222"/>
         <w:lang w:val="en-US"/>
       </w:rPr>
     </w:rPrDefault>
     <w:pPrDefault>
       <w:pPr>
-        <w:spacing w:after="160" w:line="276" w:lineRule="auto"/>
+        <w:spacing w:after="161" w:line="281" w:lineRule="auto"/>
       </w:pPr>
     </w:pPrDefault>
   </w:docDefaults>
@@ -104,15 +104,17 @@
     <w:next w:val="Normal"/>
     <w:qFormat/>
     <w:pPr>
-      <w:spacing w:before="2400" w:after="120"/>
-      <w:contextualSpacing/>
-    </w:pPr>
-    <w:rPr>
-      <w:sz w:val="72"/>
-      <w:szCs w:val="72"/>
-      <w:color w:val="1F2A44"/>
+      <w:spacing w:before="2600" w:after="160"/>
+      <w:pBdr>
+        <w:bottom w:val="single" w:sz="24" w:space="10" w:color="C8102E"/>
+      </w:pBdr>
+    </w:pPr>
+    <w:rPr>
+      <w:rFonts w:ascii="Libre Franklin" w:hAnsi="Libre Franklin" w:cs="Libre Franklin"/>
+      <w:sz w:val="80"/>
+      <w:szCs w:val="80"/>
+      <w:color w:val="0F3D4C"/>
       <w:b/>
-      <w:spacing w:val="-10"/>
     </w:rPr>
   </w:style>
   <w:style w:type="paragraph" w:styleId="Subtitle">
@@ -121,12 +123,14 @@
     <w:next w:val="Normal"/>
     <w:qFormat/>
     <w:pPr>
-      <w:spacing w:after="480"/>
-    </w:pPr>
-    <w:rPr>
-      <w:sz w:val="32"/>
-      <w:szCs w:val="32"/>
-      <w:color w:val="6B7280"/>
+      <w:spacing w:before="200" w:after="600"/>
+    </w:pPr>
+    <w:rPr>
+      <w:rFonts w:ascii="Caladea" w:hAnsi="Caladea" w:cs="Caladea"/>
+      <w:sz w:val="36"/>
+      <w:szCs w:val="36"/>
+      <w:color w:val="6B6B6B"/>
+      <w:i/>
     </w:rPr>
   </w:style>
   <w:style w:type="paragraph" w:styleId="Heading1">
@@ -137,16 +141,17 @@
     <w:pPr>
       <w:keepNext/>
       <w:keepLines/>
-      <w:spacing w:before="480" w:after="160"/>
+      <w:spacing w:before="560" w:after="200"/>
       <w:pBdr>
-        <w:bottom w:val="single" w:sz="6" w:space="4" w:color="D0D7E2"/>
+        <w:bottom w:val="single" w:sz="12" w:space="6" w:color="C8102E"/>
       </w:pBdr>
       <w:outlineLvl w:val="0"/>
     </w:pPr>
     <w:rPr>
-      <w:sz w:val="40"/>
-      <w:szCs w:val="40"/>
-      <w:color w:val="1F2A44"/>
+      <w:rFonts w:ascii="Libre Franklin" w:hAnsi="Libre Franklin" w:cs="Libre Franklin"/>
+      <w:sz w:val="42"/>
+      <w:szCs w:val="42"/>
+      <w:color w:val="0F3D4C"/>
       <w:b/>
     </w:rPr>
   </w:style>
@@ -158,13 +163,14 @@
     <w:pPr>
       <w:keepNext/>
       <w:keepLines/>
-      <w:spacing w:before="360" w:after="120"/>
+      <w:spacing w:before="400" w:after="120"/>
       <w:outlineLvl w:val="1"/>
     </w:pPr>
     <w:rPr>
+      <w:rFonts w:ascii="Libre Franklin" w:hAnsi="Libre Franklin" w:cs="Libre Franklin"/>
       <w:sz w:val="28"/>
       <w:szCs w:val="28"/>
-      <w:color w:val="2F5496"/>
+      <w:color w:val="0F3D4C"/>
       <w:b/>
     </w:rPr>
   </w:style>
@@ -176,13 +182,14 @@
     <w:pPr>
       <w:keepNext/>
       <w:keepLines/>
-      <w:spacing w:before="240" w:after="80"/>
+      <w:spacing w:before="280" w:after="80"/>
       <w:outlineLvl w:val="2"/>
     </w:pPr>
     <w:rPr>
-      <w:sz w:val="24"/>
-      <w:szCs w:val="24"/>
-      <w:color w:val="1F2328"/>
+      <w:rFonts w:ascii="Libre Franklin" w:hAnsi="Libre Franklin" w:cs="Libre Franklin"/>
+      <w:sz w:val="23"/>
+      <w:szCs w:val="23"/>
+      <w:color w:val="222222"/>
       <w:b/>
     </w:rPr>
   </w:style>
@@ -192,14 +199,14 @@
     <w:next w:val="Normal"/>
     <w:qFormat/>
     <w:pPr>
-      <w:ind w:left="720" w:right="720"/>
-      <w:spacing w:before="160" w:after="160"/>
+      <w:ind w:left="600" w:right="600"/>
+      <w:spacing w:before="160" w:after="200"/>
       <w:pBdr>
-        <w:left w:val="single" w:sz="18" w:space="12" w:color="{BLUE}"/>
+        <w:left w:val="single" w:sz="24" w:space="14" w:color="C8102E"/>
       </w:pBdr>
     </w:pPr>
     <w:rPr>
-      <w:color w:val="404040"/>
+      <w:color w:val="444444"/>
       <w:i/>
     </w:rPr>
   </w:style>
@@ -209,12 +216,12 @@
     <w:next w:val="Normal"/>
     <w:qFormat/>
     <w:pPr>
-      <w:spacing w:after="200"/>
+      <w:spacing w:after="220"/>
     </w:pPr>
     <w:rPr>
       <w:sz w:val="18"/>
       <w:szCs w:val="18"/>
-      <w:color w:val="6B7280"/>
+      <w:color w:val="6B6B6B"/>
       <w:i/>
     </w:rPr>
   </w:style>
@@ -224,14 +231,15 @@
     <w:next w:val="Normal"/>
     <w:qFormat/>
     <w:pPr>
-      <w:spacing w:after="0" w:line="240" w:lineRule="auto"/>
+      <w:spacing w:after="0" w:line="252" w:lineRule="auto"/>
       <w:shd w:val="clear" w:color="auto" w:fill="F3F4F6"/>
-      <w:ind w:left="240" w:right="240"/>
-    </w:pPr>
-    <w:rPr>
-      <w:rFonts w:ascii="Courier New" w:hAnsi="Courier New" w:cs="Courier New"/>
+      <w:ind w:left="200" w:right="200"/>
+    </w:pPr>
+    <w:rPr>
+      <w:rFonts w:ascii="Liberation Mono" w:hAnsi="Liberation Mono" w:cs="Liberation Mono"/>
       <w:sz w:val="19"/>
       <w:szCs w:val="19"/>
+      <w:color w:val="1F2328"/>
     </w:rPr>
   </w:style>
   <w:style w:type="paragraph" w:styleId="ListParagraph">
@@ -258,9 +266,10 @@
       </w:pBdr>
     </w:pPr>
     <w:rPr>
+      <w:rFonts w:ascii="Libre Franklin" w:hAnsi="Libre Franklin" w:cs="Libre Franklin"/>
       <w:sz w:val="17"/>
       <w:szCs w:val="17"/>
-      <w:color w:val="6B7280"/>
+      <w:color w:val="6B6B6B"/>
     </w:rPr>
   </w:style>
   <w:style w:type="paragraph" w:styleId="Footer">
@@ -273,9 +282,10 @@
       <w:spacing w:after="0"/>
     </w:pPr>
     <w:rPr>
+      <w:rFonts w:ascii="Libre Franklin" w:hAnsi="Libre Franklin" w:cs="Libre Franklin"/>
       <w:sz w:val="17"/>
       <w:szCs w:val="17"/>
-      <w:color w:val="6B7280"/>
+      <w:color w:val="6B6B6B"/>
     </w:rPr>
   </w:style>
   <w:style w:type="character" w:styleId="Hyperlink">
@@ -283,7 +293,7 @@
     <w:qFormat/>
     <w:pPr/>
     <w:rPr>
-      <w:color w:val="2F5496"/>
+      <w:color w:val="C8102E"/>
       <w:u w:val="single"/>
     </w:rPr>
   </w:style>

</xml_diff>